<commit_message>
Preserve repeated agreement headers and unsigned certificate signature field
</commit_message>
<xml_diff>
--- a/apps/api/src/modules/parental-consent/fixed-template/participation.docx
+++ b/apps/api/src/modules/parental-consent/fixed-template/participation.docx
@@ -555,6 +555,12 @@
         </w:rPr>
         <w:t xml:space="preserve">{{activity.commonActivities}}</w:t>
       </w:r>
+    </w:p>
+    <w:p>
+      <w:pPr>
+        <w:pageBreakBefore/>
+        <w:spacing w:line="1" w:lineRule="exact" w:after="0"/>
+      </w:pPr>
     </w:p>
     <w:tbl>
       <w:tblPr>
@@ -1357,6 +1363,7 @@
     <w:p>
       <w:pPr>
         <w:pStyle w:val="Heading2"/>
+        <w:pageBreakBefore/>
       </w:pPr>
       <w:r>
         <w:rPr>
@@ -1615,6 +1622,7 @@
     <w:p>
       <w:pPr>
         <w:pStyle w:val="Heading2"/>
+        <w:pageBreakBefore/>
       </w:pPr>
       <w:r>
         <w:rPr>

</xml_diff>